<commit_message>
refactor(attribution): standardize collaborator to Claude (Anthropic)
</commit_message>
<xml_diff>
--- a/outputs/The_Floor_That_Does_Not_Rise_FINAL_Enhanced.docx
+++ b/outputs/The_Floor_That_Does_Not_Rise_FINAL_Enhanced.docx
@@ -92,7 +92,7 @@
           <w:i/>
           <w:sz w:val="20"/>
         </w:rPr>
-        <w:t>Enhanced Final Draft — September 19, 2026</w:t>
+        <w:t>Enhanced Final Draft — September 22, 2026</w:t>
       </w:r>
     </w:p>
     <w:p>
@@ -105,7 +105,7 @@
           <w:i/>
           <w:sz w:val="18"/>
         </w:rPr>
-        <w:t>© Gia Bao Huynh (2026). Collaborator: Claude Sonnet 5 &amp; Gemini Spark.</w:t>
+        <w:t>© Gia Bao Huynh (2026). Collaborator: Claude (Anthropic).</w:t>
         <w:br/>
         <w:t>Draft manuscript prepared for open scholarly circulation and comment.</w:t>
       </w:r>

</xml_diff>